<commit_message>
Release v0.1.1 with button guide and battery fixes
</commit_message>
<xml_diff>
--- a/docs/Vibe Coding手持输入助手-Mac安装与常见提示处理.docx
+++ b/docs/Vibe Coding手持输入助手-Mac安装与常见提示处理.docx
@@ -108,7 +108,7 @@
         <w:spacing w:after="80"/>
       </w:pPr>
       <w:r>
-        <w:t>下载 VibeCodingHandInputAssistant-0.1.0.dmg。</w:t>
+        <w:t>下载 VibeCodingHandInputAssistant-0.1.1.dmg。</w:t>
       </w:r>
     </w:p>
     <w:p>
@@ -451,7 +451,462 @@
         <w:rPr>
           <w:color w:val="2E74B5"/>
         </w:rPr>
-        <w:t>五、一键烧录注意事项</w:t>
+        <w:t>五、硬件按钮与操作方式</w:t>
+      </w:r>
+    </w:p>
+    <w:p>
+      <w:r>
+        <w:t>StickS3 手持硬件连接成功后，按键作用如下：</w:t>
+      </w:r>
+    </w:p>
+    <w:tbl>
+      <w:tblPr>
+        <w:tblStyle w:val="TableGrid"/>
+        <w:tblW w:type="auto" w:w="0"/>
+        <w:jc w:val="center"/>
+        <w:tblLayout w:type="fixed"/>
+        <w:tblLook w:firstColumn="1" w:firstRow="1" w:lastColumn="0" w:lastRow="0" w:noHBand="0" w:noVBand="1" w:val="04A0"/>
+      </w:tblPr>
+      <w:tblGrid>
+        <w:gridCol w:w="3120"/>
+        <w:gridCol w:w="3120"/>
+        <w:gridCol w:w="3120"/>
+      </w:tblGrid>
+      <w:tr>
+        <w:tc>
+          <w:tcPr>
+            <w:tcW w:type="dxa" w:w="1944"/>
+            <w:shd w:fill="E8EEF5"/>
+            <w:tcMar>
+              <w:top w:w="80" w:type="dxa"/>
+              <w:start w:w="120" w:type="dxa"/>
+              <w:bottom w:w="80" w:type="dxa"/>
+              <w:end w:w="120" w:type="dxa"/>
+            </w:tcMar>
+          </w:tcPr>
+          <w:p>
+            <w:r>
+              <w:rPr>
+                <w:b/>
+              </w:rPr>
+              <w:t>硬件按钮</w:t>
+            </w:r>
+          </w:p>
+        </w:tc>
+        <w:tc>
+          <w:tcPr>
+            <w:tcW w:type="dxa" w:w="1944"/>
+            <w:shd w:fill="E8EEF5"/>
+            <w:tcMar>
+              <w:top w:w="80" w:type="dxa"/>
+              <w:start w:w="120" w:type="dxa"/>
+              <w:bottom w:w="80" w:type="dxa"/>
+              <w:end w:w="120" w:type="dxa"/>
+            </w:tcMar>
+          </w:tcPr>
+          <w:p>
+            <w:r>
+              <w:rPr>
+                <w:b/>
+              </w:rPr>
+              <w:t>操作方式</w:t>
+            </w:r>
+          </w:p>
+        </w:tc>
+        <w:tc>
+          <w:tcPr>
+            <w:tcW w:type="dxa" w:w="5256"/>
+            <w:shd w:fill="E8EEF5"/>
+            <w:tcMar>
+              <w:top w:w="80" w:type="dxa"/>
+              <w:start w:w="120" w:type="dxa"/>
+              <w:bottom w:w="80" w:type="dxa"/>
+              <w:end w:w="120" w:type="dxa"/>
+            </w:tcMar>
+          </w:tcPr>
+          <w:p>
+            <w:r>
+              <w:rPr>
+                <w:b/>
+              </w:rPr>
+              <w:t>作用</w:t>
+            </w:r>
+          </w:p>
+        </w:tc>
+      </w:tr>
+      <w:tr>
+        <w:tc>
+          <w:tcPr>
+            <w:tcW w:type="dxa" w:w="1944"/>
+            <w:tcMar>
+              <w:top w:w="80" w:type="dxa"/>
+              <w:start w:w="120" w:type="dxa"/>
+              <w:bottom w:w="80" w:type="dxa"/>
+              <w:end w:w="120" w:type="dxa"/>
+            </w:tcMar>
+            <w:vAlign w:val="center"/>
+          </w:tcPr>
+          <w:p>
+            <w:r>
+              <w:t>右侧按钮</w:t>
+            </w:r>
+          </w:p>
+        </w:tc>
+        <w:tc>
+          <w:tcPr>
+            <w:tcW w:type="dxa" w:w="1944"/>
+            <w:tcMar>
+              <w:top w:w="80" w:type="dxa"/>
+              <w:start w:w="120" w:type="dxa"/>
+              <w:bottom w:w="80" w:type="dxa"/>
+              <w:end w:w="120" w:type="dxa"/>
+            </w:tcMar>
+            <w:vAlign w:val="center"/>
+          </w:tcPr>
+          <w:p>
+            <w:r>
+              <w:t>单击一次</w:t>
+            </w:r>
+          </w:p>
+        </w:tc>
+        <w:tc>
+          <w:tcPr>
+            <w:tcW w:type="dxa" w:w="5256"/>
+            <w:tcMar>
+              <w:top w:w="80" w:type="dxa"/>
+              <w:start w:w="120" w:type="dxa"/>
+              <w:bottom w:w="80" w:type="dxa"/>
+              <w:end w:w="120" w:type="dxa"/>
+            </w:tcMar>
+            <w:vAlign w:val="center"/>
+          </w:tcPr>
+          <w:p>
+            <w:r>
+              <w:t>打开或切回 App 设置里的目标软件，例如 Codex、Claude、Kimi 或自定义 App。</w:t>
+            </w:r>
+          </w:p>
+        </w:tc>
+      </w:tr>
+      <w:tr>
+        <w:tc>
+          <w:tcPr>
+            <w:tcW w:type="dxa" w:w="1944"/>
+            <w:tcMar>
+              <w:top w:w="80" w:type="dxa"/>
+              <w:start w:w="120" w:type="dxa"/>
+              <w:bottom w:w="80" w:type="dxa"/>
+              <w:end w:w="120" w:type="dxa"/>
+            </w:tcMar>
+            <w:vAlign w:val="center"/>
+          </w:tcPr>
+          <w:p>
+            <w:r>
+              <w:t>正面蓝色按钮</w:t>
+            </w:r>
+          </w:p>
+        </w:tc>
+        <w:tc>
+          <w:tcPr>
+            <w:tcW w:type="dxa" w:w="1944"/>
+            <w:tcMar>
+              <w:top w:w="80" w:type="dxa"/>
+              <w:start w:w="120" w:type="dxa"/>
+              <w:bottom w:w="80" w:type="dxa"/>
+              <w:end w:w="120" w:type="dxa"/>
+            </w:tcMar>
+            <w:vAlign w:val="center"/>
+          </w:tcPr>
+          <w:p>
+            <w:r>
+              <w:t>按住不放</w:t>
+            </w:r>
+          </w:p>
+        </w:tc>
+        <w:tc>
+          <w:tcPr>
+            <w:tcW w:type="dxa" w:w="5256"/>
+            <w:tcMar>
+              <w:top w:w="80" w:type="dxa"/>
+              <w:start w:w="120" w:type="dxa"/>
+              <w:bottom w:w="80" w:type="dxa"/>
+              <w:end w:w="120" w:type="dxa"/>
+            </w:tcMar>
+            <w:vAlign w:val="center"/>
+          </w:tcPr>
+          <w:p>
+            <w:r>
+              <w:t>触发语音输入。默认对应 Mac 的按住 Fn 语音，也可以在 App 里设置自定义快捷键。</w:t>
+            </w:r>
+          </w:p>
+        </w:tc>
+      </w:tr>
+      <w:tr>
+        <w:tc>
+          <w:tcPr>
+            <w:tcW w:type="dxa" w:w="1944"/>
+            <w:tcMar>
+              <w:top w:w="80" w:type="dxa"/>
+              <w:start w:w="120" w:type="dxa"/>
+              <w:bottom w:w="80" w:type="dxa"/>
+              <w:end w:w="120" w:type="dxa"/>
+            </w:tcMar>
+            <w:vAlign w:val="center"/>
+          </w:tcPr>
+          <w:p>
+            <w:r>
+              <w:t>正面蓝色按钮</w:t>
+            </w:r>
+          </w:p>
+        </w:tc>
+        <w:tc>
+          <w:tcPr>
+            <w:tcW w:type="dxa" w:w="1944"/>
+            <w:tcMar>
+              <w:top w:w="80" w:type="dxa"/>
+              <w:start w:w="120" w:type="dxa"/>
+              <w:bottom w:w="80" w:type="dxa"/>
+              <w:end w:w="120" w:type="dxa"/>
+            </w:tcMar>
+            <w:vAlign w:val="center"/>
+          </w:tcPr>
+          <w:p>
+            <w:r>
+              <w:t>松开</w:t>
+            </w:r>
+          </w:p>
+        </w:tc>
+        <w:tc>
+          <w:tcPr>
+            <w:tcW w:type="dxa" w:w="5256"/>
+            <w:tcMar>
+              <w:top w:w="80" w:type="dxa"/>
+              <w:start w:w="120" w:type="dxa"/>
+              <w:bottom w:w="80" w:type="dxa"/>
+              <w:end w:w="120" w:type="dxa"/>
+            </w:tcMar>
+            <w:vAlign w:val="center"/>
+          </w:tcPr>
+          <w:p>
+            <w:r>
+              <w:t>结束语音输入。</w:t>
+            </w:r>
+          </w:p>
+        </w:tc>
+      </w:tr>
+      <w:tr>
+        <w:tc>
+          <w:tcPr>
+            <w:tcW w:type="dxa" w:w="1944"/>
+            <w:tcMar>
+              <w:top w:w="80" w:type="dxa"/>
+              <w:start w:w="120" w:type="dxa"/>
+              <w:bottom w:w="80" w:type="dxa"/>
+              <w:end w:w="120" w:type="dxa"/>
+            </w:tcMar>
+            <w:vAlign w:val="center"/>
+          </w:tcPr>
+          <w:p>
+            <w:r>
+              <w:t>正面蓝色按钮</w:t>
+            </w:r>
+          </w:p>
+        </w:tc>
+        <w:tc>
+          <w:tcPr>
+            <w:tcW w:type="dxa" w:w="1944"/>
+            <w:tcMar>
+              <w:top w:w="80" w:type="dxa"/>
+              <w:start w:w="120" w:type="dxa"/>
+              <w:bottom w:w="80" w:type="dxa"/>
+              <w:end w:w="120" w:type="dxa"/>
+            </w:tcMar>
+            <w:vAlign w:val="center"/>
+          </w:tcPr>
+          <w:p>
+            <w:r>
+              <w:t>快速双击</w:t>
+            </w:r>
+          </w:p>
+        </w:tc>
+        <w:tc>
+          <w:tcPr>
+            <w:tcW w:type="dxa" w:w="5256"/>
+            <w:tcMar>
+              <w:top w:w="80" w:type="dxa"/>
+              <w:start w:w="120" w:type="dxa"/>
+              <w:bottom w:w="80" w:type="dxa"/>
+              <w:end w:w="120" w:type="dxa"/>
+            </w:tcMar>
+            <w:vAlign w:val="center"/>
+          </w:tcPr>
+          <w:p>
+            <w:r>
+              <w:t>发送当前输入内容。发送方式可选择 Return 或 Command + Return。</w:t>
+            </w:r>
+          </w:p>
+        </w:tc>
+      </w:tr>
+      <w:tr>
+        <w:tc>
+          <w:tcPr>
+            <w:tcW w:type="dxa" w:w="1944"/>
+            <w:tcMar>
+              <w:top w:w="80" w:type="dxa"/>
+              <w:start w:w="120" w:type="dxa"/>
+              <w:bottom w:w="80" w:type="dxa"/>
+              <w:end w:w="120" w:type="dxa"/>
+            </w:tcMar>
+            <w:vAlign w:val="center"/>
+          </w:tcPr>
+          <w:p>
+            <w:r>
+              <w:t>左侧按钮</w:t>
+            </w:r>
+          </w:p>
+        </w:tc>
+        <w:tc>
+          <w:tcPr>
+            <w:tcW w:type="dxa" w:w="1944"/>
+            <w:tcMar>
+              <w:top w:w="80" w:type="dxa"/>
+              <w:start w:w="120" w:type="dxa"/>
+              <w:bottom w:w="80" w:type="dxa"/>
+              <w:end w:w="120" w:type="dxa"/>
+            </w:tcMar>
+            <w:vAlign w:val="center"/>
+          </w:tcPr>
+          <w:p>
+            <w:r>
+              <w:t>电源相关操作</w:t>
+            </w:r>
+          </w:p>
+        </w:tc>
+        <w:tc>
+          <w:tcPr>
+            <w:tcW w:type="dxa" w:w="5256"/>
+            <w:tcMar>
+              <w:top w:w="80" w:type="dxa"/>
+              <w:start w:w="120" w:type="dxa"/>
+              <w:bottom w:w="80" w:type="dxa"/>
+              <w:end w:w="120" w:type="dxa"/>
+            </w:tcMar>
+            <w:vAlign w:val="center"/>
+          </w:tcPr>
+          <w:p>
+            <w:r>
+              <w:t>当前不作为输入控制键使用。</w:t>
+            </w:r>
+          </w:p>
+        </w:tc>
+      </w:tr>
+    </w:tbl>
+    <w:p>
+      <w:r>
+        <w:t>推荐操作流程：</w:t>
+      </w:r>
+    </w:p>
+    <w:p>
+      <w:pPr>
+        <w:pStyle w:val="ListNumber"/>
+        <w:spacing w:after="80"/>
+      </w:pPr>
+      <w:r>
+        <w:t>在 App 里选择目标软件，例如 Codex。</w:t>
+      </w:r>
+    </w:p>
+    <w:p>
+      <w:pPr>
+        <w:pStyle w:val="ListNumber"/>
+        <w:spacing w:after="80"/>
+      </w:pPr>
+      <w:r>
+        <w:t>确认辅助功能权限已开启，并在蓝牙里连接 Vibe Coding Remote。</w:t>
+      </w:r>
+    </w:p>
+    <w:p>
+      <w:pPr>
+        <w:pStyle w:val="ListNumber"/>
+        <w:spacing w:after="80"/>
+      </w:pPr>
+      <w:r>
+        <w:t>在任意桌面按右侧按钮，切回目标软件。</w:t>
+      </w:r>
+    </w:p>
+    <w:p>
+      <w:pPr>
+        <w:pStyle w:val="ListNumber"/>
+        <w:spacing w:after="80"/>
+      </w:pPr>
+      <w:r>
+        <w:t>按住正面蓝色按钮说话，松开结束语音输入。</w:t>
+      </w:r>
+    </w:p>
+    <w:p>
+      <w:pPr>
+        <w:pStyle w:val="ListNumber"/>
+        <w:spacing w:after="80"/>
+      </w:pPr>
+      <w:r>
+        <w:t>确认文字无误后，双击正面蓝色按钮发送。</w:t>
+      </w:r>
+    </w:p>
+    <w:tbl>
+      <w:tblPr>
+        <w:tblW w:type="auto" w:w="0"/>
+        <w:jc w:val="center"/>
+        <w:tblLayout w:type="fixed"/>
+        <w:tblLook w:firstColumn="1" w:firstRow="1" w:lastColumn="0" w:lastRow="0" w:noHBand="0" w:noVBand="1" w:val="04A0"/>
+      </w:tblPr>
+      <w:tblGrid>
+        <w:gridCol w:w="9360"/>
+      </w:tblGrid>
+      <w:tr>
+        <w:tc>
+          <w:tcPr>
+            <w:tcW w:type="dxa" w:w="9216"/>
+            <w:vAlign w:val="center"/>
+            <w:shd w:fill="F4F6F9"/>
+            <w:tcMar>
+              <w:top w:w="120" w:type="dxa"/>
+              <w:start w:w="180" w:type="dxa"/>
+              <w:bottom w:w="120" w:type="dxa"/>
+              <w:end w:w="180" w:type="dxa"/>
+            </w:tcMar>
+          </w:tcPr>
+          <w:p>
+            <w:pPr>
+              <w:spacing w:after="80"/>
+            </w:pPr>
+            <w:r>
+              <w:rPr>
+                <w:b/>
+                <w:color w:val="1F3A5F"/>
+                <w:sz w:val="22"/>
+              </w:rPr>
+              <w:t>电量与屏幕提示</w:t>
+            </w:r>
+          </w:p>
+          <w:p>
+            <w:pPr>
+              <w:spacing w:after="0"/>
+            </w:pPr>
+            <w:r>
+              <w:t>硬件屏幕会显示连接状态、当前动作和设备电量。电脑端 App 设置面板也会显示电量，默认约每 30 秒刷新一次。</w:t>
+            </w:r>
+          </w:p>
+        </w:tc>
+      </w:tr>
+    </w:tbl>
+    <w:p/>
+    <w:p>
+      <w:pPr>
+        <w:pStyle w:val="Heading1"/>
+      </w:pPr>
+      <w:r>
+        <w:rPr>
+          <w:color w:val="2E74B5"/>
+        </w:rPr>
+        <w:t>六、一键烧录注意事项</w:t>
       </w:r>
     </w:p>
     <w:p>
@@ -498,7 +953,7 @@
         <w:rPr>
           <w:color w:val="2E74B5"/>
         </w:rPr>
-        <w:t>六、常见问题速查</w:t>
+        <w:t>七、常见问题速查</w:t>
       </w:r>
     </w:p>
     <w:tbl>
@@ -780,7 +1235,7 @@
         <w:rPr>
           <w:color w:val="2E74B5"/>
         </w:rPr>
-        <w:t>七、给测试用户的短版说明</w:t>
+        <w:t>八、给测试用户的短版说明</w:t>
       </w:r>
     </w:p>
     <w:p>
@@ -833,7 +1288,7 @@
         <w:rPr>
           <w:color w:val="2E74B5"/>
         </w:rPr>
-        <w:t>八、作者信息</w:t>
+        <w:t>九、作者信息</w:t>
       </w:r>
     </w:p>
     <w:p>

</xml_diff>

<commit_message>
Release v0.1.2 battery and flash UI fixes
</commit_message>
<xml_diff>
--- a/docs/Vibe Coding手持输入助手-Mac安装与常见提示处理.docx
+++ b/docs/Vibe Coding手持输入助手-Mac安装与常见提示处理.docx
@@ -108,7 +108,7 @@
         <w:spacing w:after="80"/>
       </w:pPr>
       <w:r>
-        <w:t>下载 VibeCodingHandInputAssistant-0.1.1.dmg。</w:t>
+        <w:t>下载 VibeCodingHandInputAssistant-0.1.2.dmg。</w:t>
       </w:r>
     </w:p>
     <w:p>
@@ -891,7 +891,7 @@
               <w:spacing w:after="0"/>
             </w:pPr>
             <w:r>
-              <w:t>硬件屏幕会显示连接状态、当前动作和设备电量。电脑端 App 设置面板也会显示电量，默认约每 30 秒刷新一次。</w:t>
+              <w:t>硬件屏幕会显示连接状态、当前动作和大号电量条。电脑端 App 设置面板也会显示电量，默认约每 30 秒刷新一次。v0.1.2 更新了固件屏幕电量条，升级后需要重新烧录 StickS3。</w:t>
             </w:r>
           </w:p>
         </w:tc>
@@ -907,6 +907,15 @@
           <w:color w:val="2E74B5"/>
         </w:rPr>
         <w:t>六、一键烧录注意事项</w:t>
+      </w:r>
+    </w:p>
+    <w:p>
+      <w:pPr>
+        <w:pStyle w:val="ListBullet"/>
+        <w:spacing w:after="80"/>
+      </w:pPr>
+      <w:r>
+        <w:t>App 设置页里的“设备烧录”默认折叠；需要更新硬件固件时，点击“展开设备烧录”。</w:t>
       </w:r>
     </w:p>
     <w:p>

</xml_diff>

<commit_message>
Release v0.1.3 remove desktop battery display
</commit_message>
<xml_diff>
--- a/docs/Vibe Coding手持输入助手-Mac安装与常见提示处理.docx
+++ b/docs/Vibe Coding手持输入助手-Mac安装与常见提示处理.docx
@@ -108,7 +108,7 @@
         <w:spacing w:after="80"/>
       </w:pPr>
       <w:r>
-        <w:t>下载 VibeCodingHandInputAssistant-0.1.2.dmg。</w:t>
+        <w:t>下载 VibeCodingHandInputAssistant-0.1.3.dmg。</w:t>
       </w:r>
     </w:p>
     <w:p>
@@ -891,7 +891,7 @@
               <w:spacing w:after="0"/>
             </w:pPr>
             <w:r>
-              <w:t>硬件屏幕会显示连接状态、当前动作和大号电量条。电脑端 App 设置面板也会显示电量，默认约每 30 秒刷新一次。v0.1.2 更新了固件屏幕电量条，升级后需要重新烧录 StickS3。</w:t>
+              <w:t>硬件屏幕会显示连接状态、当前动作和大号电量条。电脑端 App 不再显示设备电量，电量以 StickS3 屏幕为准。v0.1.3 调整了固件屏幕布局，升级后需要重新烧录 StickS3。</w:t>
             </w:r>
           </w:p>
         </w:tc>
@@ -915,7 +915,7 @@
         <w:spacing w:after="80"/>
       </w:pPr>
       <w:r>
-        <w:t>App 设置页里的“设备烧录”默认折叠；需要更新硬件固件时，点击“展开设备烧录”。</w:t>
+        <w:t>App 设置页里的“设备烧录”默认展开，插上 USB 线后可以直接刷新设备并一键烧录。</w:t>
       </w:r>
     </w:p>
     <w:p>

</xml_diff>

<commit_message>
Release v0.1.4 adjust remote screen text spacing
</commit_message>
<xml_diff>
--- a/docs/Vibe Coding手持输入助手-Mac安装与常见提示处理.docx
+++ b/docs/Vibe Coding手持输入助手-Mac安装与常见提示处理.docx
@@ -108,7 +108,7 @@
         <w:spacing w:after="80"/>
       </w:pPr>
       <w:r>
-        <w:t>下载 VibeCodingHandInputAssistant-0.1.3.dmg。</w:t>
+        <w:t>下载 VibeCodingHandInputAssistant-0.1.4.dmg。</w:t>
       </w:r>
     </w:p>
     <w:p>
@@ -891,7 +891,7 @@
               <w:spacing w:after="0"/>
             </w:pPr>
             <w:r>
-              <w:t>硬件屏幕会显示连接状态、当前动作和大号电量条。电脑端 App 不再显示设备电量，电量以 StickS3 屏幕为准。v0.1.3 调整了固件屏幕布局，升级后需要重新烧录 StickS3。</w:t>
+              <w:t>硬件屏幕会显示连接状态、当前动作和大号电量条。电脑端 App 不再显示设备电量，电量以 StickS3 屏幕为准。v0.1.4 将屏幕中间状态文字整体下移，升级后需要重新烧录 StickS3。</w:t>
             </w:r>
           </w:p>
         </w:tc>

</xml_diff>